<commit_message>
Split AI work since 10/2025 into five product projects
Fabrik, Launch Kit, e-invoicing/bookkeeping, paid browser extensions and the
autonomous AI business partner each get their own entry instead of one block.
Avance FDE Lead variant lists all five. Every page and variant re-rendered.

Co-Authored-By: Claude Opus 5.5 (1M context) <noreply@anthropic.com>
</commit_message>
<xml_diff>
--- a/cv.docx
+++ b/cv.docx
@@ -227,27 +227,139 @@
         <w:rPr>
           <w:b/>
         </w:rPr>
-        <w:t>seit 12/2025 (laufend) — Autonome KI-Agenten-Systeme — Harness &amp; Agentic Engineering</w:t>
+        <w:t>seit 04/2026 (laufend) — Fabrik — Multi-Agenten-Plattform für Softwareentwicklung</w:t>
       </w:r>
     </w:p>
     <w:p>
       <w:r>
-        <w:t>Solytics GmbH · Remote · KI / SaaS</w:t>
+        <w:t>Fabrik (fabrikhq.com) · Solytics GmbH · Remote · Software / KI</w:t>
       </w:r>
     </w:p>
     <w:p>
       <w:r>
-        <w:t>Rollen: Harness Engineering · Agent Engineering · KI-Systemarchitektur · Fullstack-Entwicklung · DevOps</w:t>
+        <w:t>Rollen: Architektur · Agent Engineering · Fullstack-Entwicklung</w:t>
       </w:r>
     </w:p>
     <w:p>
       <w:r>
-        <w:t>Aufbau autonomer KI-Agenten-Systeme auf LLM-Basis als Harness Engineer — die Ingenieursarbeit um das Modell herum, nicht das Modell selbst. Das Harness ist das Produkt: Agenten-Loop mit Abbruchbedingungen, Tool-Use über MCP, geschichtetes Memory (dauerhafte Fakten, laufender Kontext, Session-Zustand), Freigabe-Gates vor allem Unumkehrbaren, Quality Gates, die grün sein müssen, bevor ein Agent ausliefern darf, Observability über jeden Lauf, Budget- und Rate-Limit-Steuerung mit Modell-Routing und Fallback sowie Wiederaufsetzen nach einem abgebrochenen Lauf. Ein lokaler Multi-Modell-Proxy hält das Ganze unabhängig von einem einzelnen Anbieter. Zwei produktive Systeme: ein selbststeuernder KI-Geschäftspartner, der rund um die Uhr plant, Code schreibt, testet und deployt, sowie Fabrik (fabrikhq.com), eine Multi-Agenten-Plattform für autonome Softwareentwicklung mit parallelen Worker-Agenten. Ereignisgesteuerte Orchestrierung über Telegram, GitHub und systemd; mehrere KI-gebaute SaaS-Produkte end-to-end ausgeliefert.</w:t>
+        <w:t>Plattform, auf der Worker-Agenten parallel Tickets zu Pull Requests verarbeiten (fabrikhq.com). Ein Control Plane (FastAPI, Vue) startet je Repository einen eigenen Agenten-Container über den Docker-Socket. Jeder Agent durchläuft Ticket-Sync (GitHub, GitLab, Jira), Prüfung auf Umsetzbarkeit, Plan, testgetriebene Umsetzung, ein Quality Gate in einem sauberen Sidecar-Container und den PR — er merged nie selbst. Energie-Budget je Agent, Rückkopplung aus PR-Kommentaren, ein VPS je Kunde hinter Caddy.</w:t>
       </w:r>
     </w:p>
     <w:p>
       <w:r>
-        <w:t>Tech: Claude / Anthropic API, LLM-Agenten, Agent Harness, Multi-Agent-Orchestration, Tool Use / MCP, RAG, Prompt Engineering, Python, FastAPI, Vue 3, Docker, systemd, GitHub Actions, DigitalOcean, SQLite, TDD, TypeScript</w:t>
+        <w:t>Tech: Claude / Anthropic API, Multi-Agent-Orchestration, Python, FastAPI, Vue 3, Docker, Caddy, GitHub Actions, SQLite, TDD</w:t>
+      </w:r>
+    </w:p>
+    <w:p>
+      <w:r>
+        <w:rPr>
+          <w:b/>
+        </w:rPr>
+        <w:t>seit 03/2026 (laufend) — Launch Kit — mandantenfähige Identity- und E-Mail-Plattform</w:t>
+      </w:r>
+    </w:p>
+    <w:p>
+      <w:r>
+        <w:t>Launch Kit · Solytics GmbH · Remote · SaaS / IAM</w:t>
+      </w:r>
+    </w:p>
+    <w:p>
+      <w:r>
+        <w:t>Rollen: Architektur · Backend-Entwicklung · Security</w:t>
+      </w:r>
+    </w:p>
+    <w:p>
+      <w:r>
+        <w:t>OIDC-konformer Auth-Server mit E-Mail-Marketing als ein Go-Binary mit Vue-Admin-Oberfläche — Ersatz für Keycloak oder Auth0. OAuth2 mit PKCE, RS256-JWTs mit eigenem RSA-Schlüssel je Mandant, Login mit Google, rollenbasierter Zugriff. Kontakte, Segmente, Kampagnen mit asynchronem Versand, Abmeldung und DSGVO-Einwilligung. Strikte Mandantentrennung; Apps prüfen Tokens nur über JWKS und tauschen den Anbieter per Umgebungsvariable. Betreibt den Kundentrichter mehrerer eigener Produkte.</w:t>
+      </w:r>
+    </w:p>
+    <w:p>
+      <w:r>
+        <w:t>Tech: Go, OpenID Connect, OAuth2, JWT, Vue 3, SQLite, Docker, Caddy, Playwright</w:t>
+      </w:r>
+    </w:p>
+    <w:p>
+      <w:r>
+        <w:rPr>
+          <w:b/>
+        </w:rPr>
+        <w:t>seit 03/2026 (laufend) — E-Rechnung und Buchhaltung für eine GmbH</w:t>
+      </w:r>
+    </w:p>
+    <w:p>
+      <w:r>
+        <w:t>Solytics GmbH · Remote · Finanzen / Compliance</w:t>
+      </w:r>
+    </w:p>
+    <w:p>
+      <w:r>
+        <w:t>Rollen: Backend-Entwicklung · Fachkonzeption</w:t>
+      </w:r>
+    </w:p>
+    <w:p>
+      <w:r>
+        <w:t>API für XRechnung 3.0 (UBL, CII) und ZUGFeRD 2.3 mit einem Erweiterungs-Framework für branchenspezifische Felder jenseits von EN 16931 (Bau, Gesundheit, Logistik). Fünf Validierungsebenen: Pydantic, Geschäftsregeln BR-DE, Rechenkonsistenz, XSD, Schematron; GoBD-konformer Rechnungs-Lebenszyklus. Dazu eine doppelte Buchführung nach SKR04 als CLI: Bilanz, GuV, Steuern, E-Bilanz und DATEV-Export, jeder Abschluss gegen das Journal geprüft. Im echten Einsatz für die eigene GmbH.</w:t>
+      </w:r>
+    </w:p>
+    <w:p>
+      <w:r>
+        <w:t>Tech: Python, Pydantic, XRechnung / ZUGFeRD (EN 16931), Polars, FastAPI, Docker, TDD</w:t>
+      </w:r>
+    </w:p>
+    <w:p>
+      <w:r>
+        <w:rPr>
+          <w:b/>
+        </w:rPr>
+        <w:t>seit 01/2026 (laufend) — Browser-Extensions mit Bezahlung — FinGrab, PlaylistGrab, InvoiceGrab</w:t>
+      </w:r>
+    </w:p>
+    <w:p>
+      <w:r>
+        <w:t>FinGrab · Solytics GmbH · Remote · FinTech / Browser-Software</w:t>
+      </w:r>
+    </w:p>
+    <w:p>
+      <w:r>
+        <w:t>Rollen: Fullstack-Entwicklung · Release &amp; Betrieb</w:t>
+      </w:r>
+    </w:p>
+    <w:p>
+      <w:r>
+        <w:t>Portfolio von Browser-Extensions für Chrome (MV3) und Firefox aus einer Codebasis mit WXT und TypeScript; FinGrab exportiert Kursdaten von Yahoo Finance als CSV und hat rund 600 Nutzer. Live-Bezahlung über ExtPay und Stripe mit Abo und Einmalkauf. End-to-End-Tests mit Playwright gegen das gebaute Paket, Regressionstest gegen die veröffentlichte Version, Veröffentlichung per API im Chrome Web Store und auf addons.mozilla.org, Überwachung von Bewertungen, Abos und Paywall.</w:t>
+      </w:r>
+    </w:p>
+    <w:p>
+      <w:r>
+        <w:t>Tech: TypeScript, JavaScript, Browser extensions (Chrome MV3 / Firefox), WXT, Stripe / ExtPay, Playwright, TDD</w:t>
+      </w:r>
+    </w:p>
+    <w:p>
+      <w:r>
+        <w:rPr>
+          <w:b/>
+        </w:rPr>
+        <w:t>seit 10/2025 (laufend) — Autonomer KI-Geschäftspartner — Harness &amp; Agentic Engineering</w:t>
+      </w:r>
+    </w:p>
+    <w:p>
+      <w:r>
+        <w:t>Solytics GmbH · Remote · KI / Automatisierung</w:t>
+      </w:r>
+    </w:p>
+    <w:p>
+      <w:r>
+        <w:t>Rollen: Harness Engineering · Agent Engineering · KI-Systemarchitektur · DevOps</w:t>
+      </w:r>
+    </w:p>
+    <w:p>
+      <w:r>
+        <w:t>Ein selbststeuernder Agent auf Basis von Claude, der rund um die Uhr plant, Code schreibt, testet, deployt und berichtet. Gebaut als Harness Engineer — die Ingenieursarbeit um das Modell herum: Agenten-Loop mit Abbruchbedingungen, Tool-Use über MCP, geschichtetes Memory (dauerhafte Fakten, laufender Kontext, Session-Zustand), Freigabe-Gates vor allem Unumkehrbaren, Observability über jeden Lauf, Budget- und Rate-Limit-Steuerung mit Modell-Routing sowie Wiederaufsetzen nach einem abgebrochenen Lauf. Über 40 eigene Prüfwerkzeuge fangen Fehler des Agenten ab, bevor sie den Menschen erreichen. Ereignisgesteuert über Telegram, GitHub und systemd; Betrieb auf eigener Hardware mit lokalem Multi-Modell-Proxy.</w:t>
+      </w:r>
+    </w:p>
+    <w:p>
+      <w:r>
+        <w:t>Tech: Claude / Anthropic API, LLM-Agenten, Agent Harness, Tool Use / MCP, RAG, Prompt Engineering, Python, systemd, Telegram Bot API, Docker, TDD</w:t>
       </w:r>
     </w:p>
     <w:p>

</xml_diff>

<commit_message>
Projects since 10/2025 as agent-harness work
Fabrik reframed as a harness, two new entries from the existing setup
(unattended coding pipeline, verification and drift controls), the
bookkeeping entry reframed as an LLM agent in the finance back office.
Avance FDE Lead variant leads with them. All pages and variants re-rendered.

Co-Authored-By: Claude Opus 5.5 (1M context) <noreply@anthropic.com>
</commit_message>
<xml_diff>
--- a/cv.docx
+++ b/cv.docx
@@ -227,7 +227,7 @@
         <w:rPr>
           <w:b/>
         </w:rPr>
-        <w:t>seit 04/2026 (laufend) — Fabrik — Multi-Agenten-Plattform für Softwareentwicklung</w:t>
+        <w:t>seit 04/2026 (laufend) — Fabrik — Agenten-Harness für parallele Softwareentwicklung</w:t>
       </w:r>
     </w:p>
     <w:p>
@@ -237,17 +237,129 @@
     </w:p>
     <w:p>
       <w:r>
-        <w:t>Rollen: Architektur · Agent Engineering · Fullstack-Entwicklung</w:t>
+        <w:t>Rollen: Harness Engineering · Architektur · Fullstack-Entwicklung</w:t>
       </w:r>
     </w:p>
     <w:p>
       <w:r>
-        <w:t>Plattform, auf der Worker-Agenten parallel Tickets zu Pull Requests verarbeiten (fabrikhq.com). Ein Control Plane (FastAPI, Vue) startet je Repository einen eigenen Agenten-Container über den Docker-Socket. Jeder Agent durchläuft Ticket-Sync (GitHub, GitLab, Jira), Prüfung auf Umsetzbarkeit, Plan, testgetriebene Umsetzung, ein Quality Gate in einem sauberen Sidecar-Container und den PR — er merged nie selbst. Energie-Budget je Agent, Rückkopplung aus PR-Kommentaren, ein VPS je Kunde hinter Caddy.</w:t>
+        <w:t>Ein Harness, in dem Worker-Agenten parallel Tickets zu Pull Requests verarbeiten (fabrikhq.com). Ein Control Plane (FastAPI, Vue) startet je Repository einen eigenen Agenten-Container über den Docker-Socket. Jeder Agent durchläuft eine feste Schleife — Ticket-Sync (GitHub, GitLab, Jira), Prüfung auf Umsetzbarkeit, die vage Tickets zurückweist, Plan, testgetriebene Umsetzung, ein Quality Gate in einem sauberen Sidecar-Container, dann der PR; er merged nie selbst. Energie-Budget je Agent, Rückkopplung aus PR-Kommentaren in die Schleife, ein VPS je Kunde hinter Caddy.</w:t>
       </w:r>
     </w:p>
     <w:p>
       <w:r>
         <w:t>Tech: Claude / Anthropic API, Multi-Agent-Orchestration, Python, FastAPI, Vue 3, Docker, Caddy, GitHub Actions, SQLite, TDD</w:t>
+      </w:r>
+    </w:p>
+    <w:p>
+      <w:r>
+        <w:rPr>
+          <w:b/>
+        </w:rPr>
+        <w:t>seit 03/2026 (laufend) — Autonome Coding-Pipeline — Agenten arbeiten eine Auftragsschlange ab</w:t>
+      </w:r>
+    </w:p>
+    <w:p>
+      <w:r>
+        <w:t>agent-tasks · Solytics GmbH · Remote · Software / KI</w:t>
+      </w:r>
+    </w:p>
+    <w:p>
+      <w:r>
+        <w:t>Rollen: Harness Engineering · Agent Engineering · DevOps</w:t>
+      </w:r>
+    </w:p>
+    <w:p>
+      <w:r>
+        <w:t>Ein Harness, in dem Coding-Agenten Aufträge ohne Menschen an der Tastatur abarbeiten. Eine Auftragsdatei nennt Repository, Umfang, Abnahmekriterien und Modell; ein Runner auf eigener Hardware führt sie in einem isolierten Worktree aus, lässt vor jedem Push das Quality Gate laufen (Unit-Tests, Build, Review) und öffnet einen Pull Request — gemergt wird von einem Menschen. Modellwahl je Auftrag gegen ein 5-Stunden-Token-Budget, harte Zeitlimits je Lauf, höchstens ein neuer Pull Request je Repository und Nacht. Bisher 759 Aufträge über die eigenen Produkt-Repositories.</w:t>
+      </w:r>
+    </w:p>
+    <w:p>
+      <w:r>
+        <w:t>Tech: Claude / Anthropic API, Python, Docker, TDD, systemd</w:t>
+      </w:r>
+    </w:p>
+    <w:p>
+      <w:r>
+        <w:rPr>
+          <w:b/>
+        </w:rPr>
+        <w:t>seit 10/2025 (laufend) — Autonomer KI-Geschäftspartner — Harness &amp; Agentic Engineering</w:t>
+      </w:r>
+    </w:p>
+    <w:p>
+      <w:r>
+        <w:t>Solytics GmbH · Remote · KI / Automatisierung</w:t>
+      </w:r>
+    </w:p>
+    <w:p>
+      <w:r>
+        <w:t>Rollen: Harness Engineering · Agent Engineering · KI-Systemarchitektur · DevOps</w:t>
+      </w:r>
+    </w:p>
+    <w:p>
+      <w:r>
+        <w:t>Ein selbststeuernder Agent auf Basis von Claude, der rund um die Uhr plant, Code schreibt, testet, deployt und berichtet. Gebaut als Harness Engineer — die Ingenieursarbeit um das Modell herum: Agenten-Loop mit Abbruchbedingungen, Tool-Use über MCP, geschichtetes Memory (dauerhafte Fakten, laufender Kontext, Session-Zustand), Freigabe-Gates vor allem Unumkehrbaren, Observability über jeden Lauf, Budget- und Rate-Limit-Steuerung mit Modell-Routing sowie Wiederaufsetzen nach einem abgebrochenen Lauf. Über 40 eigene Prüfwerkzeuge fangen Fehler des Agenten ab, bevor sie den Menschen erreichen. Ereignisgesteuert über Telegram, GitHub und systemd; Betrieb auf eigener Hardware mit lokalem Multi-Modell-Proxy.</w:t>
+      </w:r>
+    </w:p>
+    <w:p>
+      <w:r>
+        <w:t>Tech: Claude / Anthropic API, LLM-Agenten, Agent Harness, Tool Use / MCP, RAG, Prompt Engineering, Python, systemd, Telegram Bot API, Docker, TDD</w:t>
+      </w:r>
+    </w:p>
+    <w:p>
+      <w:r>
+        <w:rPr>
+          <w:b/>
+        </w:rPr>
+        <w:t>seit 03/2026 (laufend) — Verifikation und Drift-Kontrolle für LLM-Agenten</w:t>
+      </w:r>
+    </w:p>
+    <w:p>
+      <w:r>
+        <w:t>Solytics GmbH · Remote · KI / Automatisierung</w:t>
+      </w:r>
+    </w:p>
+    <w:p>
+      <w:r>
+        <w:t>Rollen: Evaluation &amp; Verifikation · Reliability Engineering</w:t>
+      </w:r>
+    </w:p>
+    <w:p>
+      <w:r>
+        <w:t>Über 40 eigene Prüfwerkzeuge, die die Arbeit eines Agenten an der Wirklichkeit messen statt an seinem eigenen Bericht: jeder Link in einer ausgehenden Nachricht wird vor dem Senden aufgelöst, Zusagen des Agenten werden bis zur Einlösung verfolgt, unbeantwortete Nachrichten gemeldet, die Mergebarkeit eines Pull Requests mit git gerechnet statt aus einem veralteten API-Wert gelesen, und ein Testlauf, der nie startete, schlägt fehl, statt still zu bestehen. Jede Prüfung ist fail-closed — unbekannt heißt nie gesund — und hat eigene Tests. Watchdogs über die Dienste und Zugangsdaten des Agenten, mit einem zweiten Alarmweg für den Fall, dass der Hauptkanal selbst ausfällt.</w:t>
+      </w:r>
+    </w:p>
+    <w:p>
+      <w:r>
+        <w:t>Tech: Claude / Anthropic API, Python, Docker, TDD</w:t>
+      </w:r>
+    </w:p>
+    <w:p>
+      <w:r>
+        <w:rPr>
+          <w:b/>
+        </w:rPr>
+        <w:t>seit 03/2026 (laufend) — LLM-Agent in der Finanzbuchhaltung einer GmbH</w:t>
+      </w:r>
+    </w:p>
+    <w:p>
+      <w:r>
+        <w:t>Solytics GmbH · Remote · Finanzen / Compliance</w:t>
+      </w:r>
+    </w:p>
+    <w:p>
+      <w:r>
+        <w:t>Rollen: Agenten-Integration · Fachkonzeption · Backend-Entwicklung</w:t>
+      </w:r>
+    </w:p>
+    <w:p>
+      <w:r>
+        <w:t>Ein Agent, der die Buchhaltung einer deutschen GmbH durchgängig führt; jede Meldung gibt ein Mensch frei. Er legt Kontoauszüge und Belege ab, bucht doppelt nach SKR04 über eine eigene CLI, gleicht jedes Konto mit dem Auszug ab und prüft Umsatzsteuer- und Lohnsteuer-Anmeldungen vor dem Absenden gegen das Journal — einmal fing er so ein Feld ab, das die Vorsteuer gekostet hätte. Darunter die Werkzeuge: eine API für XRechnung 3.0 und ZUGFeRD 2.3 mit fünf Validierungsschichten (Pydantic, BR-DE-Regeln, Arithmetik, XSD, Schematron), Bilanz, GuV, E-Bilanz und DATEV-Export.</w:t>
+      </w:r>
+    </w:p>
+    <w:p>
+      <w:r>
+        <w:t>Tech: Python, Pydantic, XRechnung / ZUGFeRD (EN 16931), Polars, FastAPI, Docker, TDD</w:t>
       </w:r>
     </w:p>
     <w:p>
@@ -283,34 +395,6 @@
         <w:rPr>
           <w:b/>
         </w:rPr>
-        <w:t>seit 03/2026 (laufend) — E-Rechnung und Buchhaltung für eine GmbH</w:t>
-      </w:r>
-    </w:p>
-    <w:p>
-      <w:r>
-        <w:t>Solytics GmbH · Remote · Finanzen / Compliance</w:t>
-      </w:r>
-    </w:p>
-    <w:p>
-      <w:r>
-        <w:t>Rollen: Backend-Entwicklung · Fachkonzeption</w:t>
-      </w:r>
-    </w:p>
-    <w:p>
-      <w:r>
-        <w:t>API für XRechnung 3.0 (UBL, CII) und ZUGFeRD 2.3 mit einem Erweiterungs-Framework für branchenspezifische Felder jenseits von EN 16931 (Bau, Gesundheit, Logistik). Fünf Validierungsebenen: Pydantic, Geschäftsregeln BR-DE, Rechenkonsistenz, XSD, Schematron; GoBD-konformer Rechnungs-Lebenszyklus. Dazu eine doppelte Buchführung nach SKR04 als CLI: Bilanz, GuV, Steuern, E-Bilanz und DATEV-Export, jeder Abschluss gegen das Journal geprüft. Im echten Einsatz für die eigene GmbH.</w:t>
-      </w:r>
-    </w:p>
-    <w:p>
-      <w:r>
-        <w:t>Tech: Python, Pydantic, XRechnung / ZUGFeRD (EN 16931), Polars, FastAPI, Docker, TDD</w:t>
-      </w:r>
-    </w:p>
-    <w:p>
-      <w:r>
-        <w:rPr>
-          <w:b/>
-        </w:rPr>
         <w:t>seit 01/2026 (laufend) — Browser-Extensions mit Bezahlung — FinGrab, PlaylistGrab, InvoiceGrab</w:t>
       </w:r>
     </w:p>
@@ -332,34 +416,6 @@
     <w:p>
       <w:r>
         <w:t>Tech: TypeScript, JavaScript, Browser extensions (Chrome MV3 / Firefox), WXT, Stripe / ExtPay, Playwright, TDD</w:t>
-      </w:r>
-    </w:p>
-    <w:p>
-      <w:r>
-        <w:rPr>
-          <w:b/>
-        </w:rPr>
-        <w:t>seit 10/2025 (laufend) — Autonomer KI-Geschäftspartner — Harness &amp; Agentic Engineering</w:t>
-      </w:r>
-    </w:p>
-    <w:p>
-      <w:r>
-        <w:t>Solytics GmbH · Remote · KI / Automatisierung</w:t>
-      </w:r>
-    </w:p>
-    <w:p>
-      <w:r>
-        <w:t>Rollen: Harness Engineering · Agent Engineering · KI-Systemarchitektur · DevOps</w:t>
-      </w:r>
-    </w:p>
-    <w:p>
-      <w:r>
-        <w:t>Ein selbststeuernder Agent auf Basis von Claude, der rund um die Uhr plant, Code schreibt, testet, deployt und berichtet. Gebaut als Harness Engineer — die Ingenieursarbeit um das Modell herum: Agenten-Loop mit Abbruchbedingungen, Tool-Use über MCP, geschichtetes Memory (dauerhafte Fakten, laufender Kontext, Session-Zustand), Freigabe-Gates vor allem Unumkehrbaren, Observability über jeden Lauf, Budget- und Rate-Limit-Steuerung mit Modell-Routing sowie Wiederaufsetzen nach einem abgebrochenen Lauf. Über 40 eigene Prüfwerkzeuge fangen Fehler des Agenten ab, bevor sie den Menschen erreichen. Ereignisgesteuert über Telegram, GitHub und systemd; Betrieb auf eigener Hardware mit lokalem Multi-Modell-Proxy.</w:t>
-      </w:r>
-    </w:p>
-    <w:p>
-      <w:r>
-        <w:t>Tech: Claude / Anthropic API, LLM-Agenten, Agent Harness, Tool Use / MCP, RAG, Prompt Engineering, Python, systemd, Telegram Bot API, Docker, TDD</w:t>
       </w:r>
     </w:p>
     <w:p>

</xml_diff>